<commit_message>
Update case study citation to Zaremba (2021) textbook
Replace placeholder textbook source with the correct course text:
Zaremba, A. J. (2021). Organizational Communication: Foundations for
Collaboration (4th ed.). Kendall Hunt Publishing. Updated all in-text
citations and the reference list accordingly.

Co-Authored-By: Claude Opus 4.8 <noreply@anthropic.com>
Claude-Session: https://claude.ai/code/session_01YKrGN8sBQusKKdYNWT7jJX
</commit_message>
<xml_diff>
--- a/jerrys_world/Rando_Systems_Case_Study.docx
+++ b/jerrys_world/Rando_Systems_Case_Study.docx
@@ -177,7 +177,7 @@
           <w:sz w:val="24"/>
           <w:szCs w:val="24"/>
         </w:rPr>
-        <w:t xml:space="preserve">Rando Systems' experience illustrates how a firm can undermine an excellent reputation not through a flawed product, but through a failure to manage communication during rapid international growth. Chaney and Martin (2014) emphasize that effective intercultural business communication depends on shared meaning, appropriate channels, and relationships that build trust across cultural and geographic boundaries. The following analysis examines the roots of Rando's communication problems, what the company could have done before expanding, and what it can do now to restore communication between the Atlanta and European offices.</w:t>
+        <w:t xml:space="preserve">Rando Systems' experience illustrates how a firm can undermine an excellent reputation not through a flawed product, but through a failure to manage communication during rapid international growth. Zaremba (2021) emphasizes that effective organizational communication depends on shared meaning, appropriate channels, and relationships that build collaboration across cultural and geographic boundaries. The following analysis examines the roots of Rando's communication problems, what the company could have done before expanding, and what it can do now to restore communication between the Atlanta and European offices.</w:t>
       </w:r>
     </w:p>
     <w:p>
@@ -207,7 +207,7 @@
           <w:sz w:val="24"/>
           <w:szCs w:val="24"/>
         </w:rPr>
-        <w:t xml:space="preserve">The roots of Rando's communication problems lie in an abrupt shift from a relationship-rich, informal communication culture to an impersonal, technology-dependent one that was never intentionally designed. Before expansion, the tightly knit Atlanta team relied on face-to-face meetings, telephone conversations, and informal gatherings such as lunches and weekend parties. These high-context, relationship-based interactions produced a constant flow of information and shared understanding of the product and market. When the UK, French, German, and San Francisco offices opened, the company replaced this rich exchange with almost exclusive reliance on e-mail—a lean, low-context channel poorly suited to conveying the nuance of a sophisticated speech-recognition product or to building trust among strangers. Chaney and Martin (2014) note that communication effectiveness is heavily influenced by the choice of channel and by the context and relationships surrounding the message; Rando essentially stripped away the interpersonal context that had made its original team so cohesive.</w:t>
+        <w:t xml:space="preserve">The roots of Rando's communication problems lie in an abrupt shift from a relationship-rich, informal communication culture to an impersonal, technology-dependent one that was never intentionally designed. Before expansion, the tightly knit Atlanta team relied on face-to-face meetings, telephone conversations, and informal gatherings such as lunches and weekend parties. These relationship-based interactions produced a constant flow of information and a shared understanding of the product and market. When the UK, French, German, and San Francisco offices opened, the company replaced this rich exchange with almost exclusive reliance on e-mail—a lean channel poorly suited to conveying the nuance of a sophisticated speech-recognition product or to building trust among strangers. Zaremba (2021) notes that communication effectiveness is heavily influenced by the choice of channel and by the relationships and context surrounding the message; Rando essentially stripped away the interpersonal context that had made its original team so cohesive.</w:t>
       </w:r>
     </w:p>
     <w:p>
@@ -251,7 +251,7 @@
           <w:sz w:val="24"/>
           <w:szCs w:val="24"/>
         </w:rPr>
-        <w:t xml:space="preserve">Before expanding, Rando could have reduced its communication problems by planning the communication infrastructure and human relationships with the same care it gave to product development. First, the company should have established a single, compatible communication platform—one unified e-mail system and a well-governed intranet with a designated owner responsible for keeping information current—so that messages and companywide broadcasts would reach every office reliably. Second, Rando should have invested in a genuine onboarding and training program: bringing new international hires to Atlanta for an extended orientation, pairing them with experienced mentors, and giving them time to learn both the technology and the organization before being expected to sell and service it independently. Third, the company should have deliberately built cross-office relationships before they were needed, through reciprocal visits, joint planning sessions, and intercultural training that prepared both American and European staff to interpret one another's communication styles rather than defaulting to stereotypes of 'dictatorial' or 'aloof.' Chaney and Martin (2014) stress that anticipating cultural differences and establishing clear communication norms in advance are essential to successful international operations.</w:t>
+        <w:t xml:space="preserve">Before expanding, Rando could have reduced its communication problems by planning the communication infrastructure and human relationships with the same care it gave to product development. First, the company should have established a single, compatible communication platform—one unified e-mail system and a well-governed intranet with a designated owner responsible for keeping information current—so that messages and companywide broadcasts would reach every office reliably. Second, Rando should have invested in a genuine onboarding and training program: bringing new international hires to Atlanta for an extended orientation, pairing them with experienced mentors, and giving them time to learn both the technology and the organization before being expected to sell and service it independently. Third, the company should have deliberately built cross-office relationships before they were needed, through reciprocal visits, joint planning sessions, and intercultural training that prepared both American and European staff to interpret one another's communication styles rather than defaulting to stereotypes of 'dictatorial' or 'aloof.' Zaremba (2021) stresses that anticipating differences and establishing clear communication norms in advance are essential to building collaboration across an organization.</w:t>
       </w:r>
     </w:p>
     <w:p>
@@ -295,7 +295,7 @@
           <w:sz w:val="24"/>
           <w:szCs w:val="24"/>
         </w:rPr>
-        <w:t xml:space="preserve">Given the present situation, Rando must act on three fronts—technical, structural, and relational—to repair communication between Atlanta and Europe. Technically, the company should immediately migrate all offices onto one integrated e-mail and collaboration system and assign clear ownership for maintaining the intranet so information stays accurate and people begin using it again. Structurally, Rando should appoint liaisons or boundary-spanners who bridge the offices, schedule regular synchronized meetings that respect time-zone differences, and establish shared expectations and accountability for joint sales, marketing, and service coordination—supported by incentives that reward cross-office collaboration on global accounts rather than allowing each region to operate as an autonomous entity. Relationally, and most importantly, leadership must rebuild trust: exchange visits, video conferencing that restores face-to-face contact, and intercultural training that helps each side understand the other's perspective can dismantle the perceptions of the Europeans as aloof and the Americans as oppressive. Chaney and Martin (2014) observe that restoring effective intercultural communication requires both appropriate media and intentional efforts to understand and respect cultural differences.</w:t>
+        <w:t xml:space="preserve">Given the present situation, Rando must act on three fronts—technical, structural, and relational—to repair communication between Atlanta and Europe. Technically, the company should immediately migrate all offices onto one integrated e-mail and collaboration system and assign clear ownership for maintaining the intranet so information stays accurate and people begin using it again. Structurally, Rando should appoint liaisons or boundary-spanners who bridge the offices, schedule regular synchronized meetings that respect time-zone differences, and establish shared expectations and accountability for joint sales, marketing, and service coordination—supported by incentives that reward cross-office collaboration on global accounts rather than allowing each region to operate as an autonomous entity. Relationally, and most importantly, leadership must rebuild trust: exchange visits, video conferencing that restores face-to-face contact, and intercultural training that helps each side understand the other's perspective can dismantle the perceptions of the Europeans as aloof and the Americans as oppressive. Zaremba (2021) observes that restoring effective communication requires both appropriate media and intentional efforts to understand and collaborate across differences.</w:t>
       </w:r>
     </w:p>
     <w:p>
@@ -339,7 +339,7 @@
           <w:sz w:val="24"/>
           <w:szCs w:val="24"/>
         </w:rPr>
-        <w:t xml:space="preserve">Rando Systems' communication problems stem not from geography alone but from expanding internationally without the communication systems, training, and relationships needed to sustain a dispersed organization. Careful planning before expansion would have prevented most of these breakdowns, and a coordinated technical, structural, and relational effort can still restore alignment today. Grounded in both sound communication theory (Chaney &amp; Martin, 2014) and biblical principles of planning, edifying speech, and seeking one another's interests, Rando can rebuild the shared understanding that once made it an excellent company and protect the reputation its rapid growth has placed at risk.</w:t>
+        <w:t xml:space="preserve">Rando Systems' communication problems stem not from geography alone but from expanding internationally without the communication systems, training, and relationships needed to sustain a dispersed organization. Careful planning before expansion would have prevented most of these breakdowns, and a coordinated technical, structural, and relational effort can still restore alignment today. Grounded in both sound organizational communication theory (Zaremba, 2021) and biblical principles of planning, edifying speech, and seeking one another's interests, Rando can rebuild the shared understanding that once made it an excellent company and protect the reputation its rapid growth has placed at risk.</w:t>
       </w:r>
     </w:p>
     <w:p>
@@ -377,7 +377,21 @@
           <w:sz w:val="24"/>
           <w:szCs w:val="24"/>
         </w:rPr>
-        <w:t xml:space="preserve">Chaney, L. H., &amp; Martin, J. S. (2014). </w:t>
+        <w:t xml:space="preserve">New International Version Bible. (2011). Zondervan. https://www.biblegateway.com (Original work published 1973)</w:t>
+      </w:r>
+    </w:p>
+    <w:p>
+      <w:pPr>
+        <w:spacing w:after="0" w:line="480"/>
+        <w:ind w:left="720" w:hanging="720"/>
+      </w:pPr>
+      <w:r>
+        <w:rPr>
+          <w:rFonts w:ascii="Times New Roman" w:cs="Times New Roman" w:eastAsia="Times New Roman" w:hAnsi="Times New Roman"/>
+          <w:sz w:val="24"/>
+          <w:szCs w:val="24"/>
+        </w:rPr>
+        <w:t xml:space="preserve">Zaremba, A. J. (2021). </w:t>
       </w:r>
       <w:r>
         <w:rPr>
@@ -387,29 +401,15 @@
           <w:sz w:val="24"/>
           <w:szCs w:val="24"/>
         </w:rPr>
-        <w:t xml:space="preserve">Intercultural business communication</w:t>
-      </w:r>
-      <w:r>
-        <w:rPr>
-          <w:rFonts w:ascii="Times New Roman" w:cs="Times New Roman" w:eastAsia="Times New Roman" w:hAnsi="Times New Roman"/>
-          <w:sz w:val="24"/>
-          <w:szCs w:val="24"/>
-        </w:rPr>
-        <w:t xml:space="preserve"> (6th ed.). Pearson.</w:t>
-      </w:r>
-    </w:p>
-    <w:p>
-      <w:pPr>
-        <w:spacing w:after="0" w:line="480"/>
-        <w:ind w:left="720" w:hanging="720"/>
-      </w:pPr>
-      <w:r>
-        <w:rPr>
-          <w:rFonts w:ascii="Times New Roman" w:cs="Times New Roman" w:eastAsia="Times New Roman" w:hAnsi="Times New Roman"/>
-          <w:sz w:val="24"/>
-          <w:szCs w:val="24"/>
-        </w:rPr>
-        <w:t xml:space="preserve">New International Version Bible. (2011). Zondervan. https://www.biblegateway.com (Original work published 1973)</w:t>
+        <w:t xml:space="preserve">Organizational communication: Foundations for collaboration</w:t>
+      </w:r>
+      <w:r>
+        <w:rPr>
+          <w:rFonts w:ascii="Times New Roman" w:cs="Times New Roman" w:eastAsia="Times New Roman" w:hAnsi="Times New Roman"/>
+          <w:sz w:val="24"/>
+          <w:szCs w:val="24"/>
+        </w:rPr>
+        <w:t xml:space="preserve"> (4th ed.). Kendall Hunt Publishing. https://libertyonline.vitalsource.com/books/9781792461774</w:t>
       </w:r>
     </w:p>
     <w:sectPr>

</xml_diff>